<commit_message>
feat(admin,export): modernize UI/UX layouts, loading states, and SKEAP DOCX generation
- Standardize and sync skeleton loaders across all /admin modules (Grantees, Members, KK Profiling, Inquiries, SKEAP Applications/Waitlist) to eliminate CLS and match updated layouts.
- Resolve Prisma P2022 query errors by refactoring dynamic filters with relational subqueries and clean object spreading.
- Overhauled SKEAP Application Form DOCX export pipeline:
- Added database migration and schema updates for grantee educational backgrounds.
</commit_message>
<xml_diff>
--- a/public/SKEAP Application Form (2).docx
+++ b/public/SKEAP Application Form (2).docx
@@ -79,12 +79,12 @@
                                 <w:sz w:val="24"/>
                                 <w:szCs w:val="24"/>
                               </w:rPr>
-                              <w:t>{%profilePhoto}</w:t>
+                              <w:t>{%profileImage}</w:t>
                             </w:r>
                           </w:p>
                         </w:txbxContent>
                       </wps:txbx>
-                      <wps:bodyPr rot="0" spcFirstLastPara="0" vertOverflow="overflow" horzOverflow="overflow" vert="horz" wrap="square" lIns="91440" tIns="45720" rIns="91440" bIns="45720" numCol="1" spcCol="0" rtlCol="0" fromWordArt="0" anchor="ctr" anchorCtr="0" forceAA="0" compatLnSpc="1">
+                      <wps:bodyPr rot="0" spcFirstLastPara="0" vertOverflow="overflow" horzOverflow="overflow" vert="horz" wrap="square" lIns="0" tIns="0" rIns="0" bIns="0" numCol="1" spcCol="0" rtlCol="0" fromWordArt="0" anchor="ctr" anchorCtr="0" forceAA="0" compatLnSpc="1">
                         <a:noAutofit/>
                       </wps:bodyPr>
                     </wps:wsp>
@@ -112,7 +112,7 @@
                           <w:sz w:val="24"/>
                           <w:szCs w:val="24"/>
                         </w:rPr>
-                        <w:t>{%profilePhoto}</w:t>
+                        <w:t>{%profileImage}</w:t>
                       </w:r>
                     </w:p>
                   </w:txbxContent>
@@ -427,7 +427,7 @@
               <w:rPr>
                 <w:rFonts w:ascii="Bookman Old Style" w:hAnsi="Bookman Old Style"/>
               </w:rPr>
-              <w:t xml:space="preserve">Registered Voter:    _____ Yes     _____ No    </w:t>
+              <w:t xml:space="preserve">Registered Voter:    {voterYes}     {voterNo}    </w:t>
             </w:r>
           </w:p>
           <w:p>
@@ -536,7 +536,7 @@
                 <w:szCs w:val="24"/>
                 <w:lang w:val="en-US"/>
               </w:rPr>
-              <w:t xml:space="preserve">  </w:t>
+              <w:tab/>
             </w:r>
             <w:r>
               <w:rPr>
@@ -566,7 +566,7 @@
                 <w:rFonts w:hint="default" w:ascii="Bookman Old Style" w:hAnsi="Bookman Old Style"/>
                 <w:lang w:val="en-US"/>
               </w:rPr>
-              <w:t xml:space="preserve"> </w:t>
+              <w:tab/>
             </w:r>
             <w:r>
               <w:rPr>

</xml_diff>